<commit_message>
feat: add lab 6 (optimization methods)
</commit_message>
<xml_diff>
--- a/Пронин В.К. ИУ5Ц-83Б ЛР6 ТМО.docx
+++ b/Пронин В.К. ИУ5Ц-83Б ЛР6 ТМО.docx
@@ -885,14 +885,16 @@
       <w:pPr>
         <w:pStyle w:val="21"/>
         <w:tabs>
-          <w:tab w:val="left" w:pos="660"/>
+          <w:tab w:val="left" w:pos="720"/>
           <w:tab w:val="right" w:leader="dot" w:pos="9344"/>
         </w:tabs>
         <w:rPr>
           <w:rFonts w:asciiTheme="minorHAnsi" w:eastAsiaTheme="minorEastAsia" w:hAnsiTheme="minorHAnsi" w:cstheme="minorBidi"/>
           <w:noProof/>
-          <w:sz w:val="28"/>
-          <w:szCs w:val="28"/>
+          <w:kern w:val="2"/>
+          <w:sz w:val="28"/>
+          <w:szCs w:val="28"/>
+          <w14:ligatures w14:val="standardContextual"/>
         </w:rPr>
       </w:pPr>
       <w:r>
@@ -916,7 +918,7 @@
         </w:rPr>
         <w:fldChar w:fldCharType="separate"/>
       </w:r>
-      <w:hyperlink w:anchor="_Toc161683608" w:history="1">
+      <w:hyperlink w:anchor="_Toc232602888" w:history="1">
         <w:r>
           <w:rPr>
             <w:rStyle w:val="a5"/>
@@ -930,8 +932,10 @@
           <w:rPr>
             <w:rFonts w:asciiTheme="minorHAnsi" w:eastAsiaTheme="minorEastAsia" w:hAnsiTheme="minorHAnsi" w:cstheme="minorBidi"/>
             <w:noProof/>
-            <w:sz w:val="28"/>
-            <w:szCs w:val="28"/>
+            <w:kern w:val="2"/>
+            <w:sz w:val="28"/>
+            <w:szCs w:val="28"/>
+            <w14:ligatures w14:val="standardContextual"/>
           </w:rPr>
           <w:tab/>
         </w:r>
@@ -969,7 +973,7 @@
             <w:sz w:val="28"/>
             <w:szCs w:val="28"/>
           </w:rPr>
-          <w:instrText xml:space="preserve"> PAGEREF _Toc161683608 \h </w:instrText>
+          <w:instrText xml:space="preserve"> PAGEREF _Toc232602888 \h </w:instrText>
         </w:r>
         <w:r>
           <w:rPr>
@@ -1012,17 +1016,19 @@
       <w:pPr>
         <w:pStyle w:val="21"/>
         <w:tabs>
-          <w:tab w:val="left" w:pos="660"/>
+          <w:tab w:val="left" w:pos="720"/>
           <w:tab w:val="right" w:leader="dot" w:pos="9344"/>
         </w:tabs>
         <w:rPr>
           <w:rFonts w:asciiTheme="minorHAnsi" w:eastAsiaTheme="minorEastAsia" w:hAnsiTheme="minorHAnsi" w:cstheme="minorBidi"/>
           <w:noProof/>
-          <w:sz w:val="28"/>
-          <w:szCs w:val="28"/>
-        </w:rPr>
-      </w:pPr>
-      <w:hyperlink w:anchor="_Toc161683609" w:history="1">
+          <w:kern w:val="2"/>
+          <w:sz w:val="28"/>
+          <w:szCs w:val="28"/>
+          <w14:ligatures w14:val="standardContextual"/>
+        </w:rPr>
+      </w:pPr>
+      <w:hyperlink w:anchor="_Toc232602889" w:history="1">
         <w:r>
           <w:rPr>
             <w:rStyle w:val="a5"/>
@@ -1036,8 +1042,10 @@
           <w:rPr>
             <w:rFonts w:asciiTheme="minorHAnsi" w:eastAsiaTheme="minorEastAsia" w:hAnsiTheme="minorHAnsi" w:cstheme="minorBidi"/>
             <w:noProof/>
-            <w:sz w:val="28"/>
-            <w:szCs w:val="28"/>
+            <w:kern w:val="2"/>
+            <w:sz w:val="28"/>
+            <w:szCs w:val="28"/>
+            <w14:ligatures w14:val="standardContextual"/>
           </w:rPr>
           <w:tab/>
         </w:r>
@@ -1075,7 +1083,7 @@
             <w:sz w:val="28"/>
             <w:szCs w:val="28"/>
           </w:rPr>
-          <w:instrText xml:space="preserve"> PAGEREF _Toc161683609 \h </w:instrText>
+          <w:instrText xml:space="preserve"> PAGEREF _Toc232602889 \h </w:instrText>
         </w:r>
         <w:r>
           <w:rPr>
@@ -1118,23 +1126,26 @@
       <w:pPr>
         <w:pStyle w:val="21"/>
         <w:tabs>
-          <w:tab w:val="left" w:pos="660"/>
+          <w:tab w:val="left" w:pos="720"/>
           <w:tab w:val="right" w:leader="dot" w:pos="9344"/>
         </w:tabs>
         <w:rPr>
           <w:rFonts w:asciiTheme="minorHAnsi" w:eastAsiaTheme="minorEastAsia" w:hAnsiTheme="minorHAnsi" w:cstheme="minorBidi"/>
           <w:noProof/>
-          <w:sz w:val="28"/>
-          <w:szCs w:val="28"/>
-        </w:rPr>
-      </w:pPr>
-      <w:hyperlink w:anchor="_Toc161683610" w:history="1">
+          <w:kern w:val="2"/>
+          <w:sz w:val="28"/>
+          <w:szCs w:val="28"/>
+          <w14:ligatures w14:val="standardContextual"/>
+        </w:rPr>
+      </w:pPr>
+      <w:hyperlink w:anchor="_Toc232602890" w:history="1">
         <w:r>
           <w:rPr>
             <w:rStyle w:val="a5"/>
             <w:noProof/>
             <w:sz w:val="28"/>
             <w:szCs w:val="28"/>
+            <w:lang w:val="en-US"/>
           </w:rPr>
           <w:t>3.</w:t>
         </w:r>
@@ -1142,8 +1153,10 @@
           <w:rPr>
             <w:rFonts w:asciiTheme="minorHAnsi" w:eastAsiaTheme="minorEastAsia" w:hAnsiTheme="minorHAnsi" w:cstheme="minorBidi"/>
             <w:noProof/>
-            <w:sz w:val="28"/>
-            <w:szCs w:val="28"/>
+            <w:kern w:val="2"/>
+            <w:sz w:val="28"/>
+            <w:szCs w:val="28"/>
+            <w14:ligatures w14:val="standardContextual"/>
           </w:rPr>
           <w:tab/>
         </w:r>
@@ -1154,7 +1167,7 @@
             <w:sz w:val="28"/>
             <w:szCs w:val="28"/>
           </w:rPr>
-          <w:t>Основные характеристики датасета</w:t>
+          <w:t>Теоретические основы</w:t>
         </w:r>
         <w:r>
           <w:rPr>
@@ -1181,7 +1194,7 @@
             <w:sz w:val="28"/>
             <w:szCs w:val="28"/>
           </w:rPr>
-          <w:instrText xml:space="preserve"> PAGEREF _Toc161683610 \h </w:instrText>
+          <w:instrText xml:space="preserve"> PAGEREF _Toc232602890 \h </w:instrText>
         </w:r>
         <w:r>
           <w:rPr>
@@ -1224,17 +1237,239 @@
       <w:pPr>
         <w:pStyle w:val="21"/>
         <w:tabs>
-          <w:tab w:val="left" w:pos="660"/>
+          <w:tab w:val="left" w:pos="960"/>
           <w:tab w:val="right" w:leader="dot" w:pos="9344"/>
         </w:tabs>
         <w:rPr>
           <w:rFonts w:asciiTheme="minorHAnsi" w:eastAsiaTheme="minorEastAsia" w:hAnsiTheme="minorHAnsi" w:cstheme="minorBidi"/>
           <w:noProof/>
-          <w:sz w:val="28"/>
-          <w:szCs w:val="28"/>
-        </w:rPr>
-      </w:pPr>
-      <w:hyperlink w:anchor="_Toc161683611" w:history="1">
+          <w:kern w:val="2"/>
+          <w:sz w:val="28"/>
+          <w:szCs w:val="28"/>
+          <w14:ligatures w14:val="standardContextual"/>
+        </w:rPr>
+      </w:pPr>
+      <w:hyperlink w:anchor="_Toc232602891" w:history="1">
+        <w:r>
+          <w:rPr>
+            <w:rStyle w:val="a5"/>
+            <w:noProof/>
+            <w:sz w:val="28"/>
+            <w:szCs w:val="28"/>
+          </w:rPr>
+          <w:t>3.1.</w:t>
+        </w:r>
+        <w:r>
+          <w:rPr>
+            <w:rFonts w:asciiTheme="minorHAnsi" w:eastAsiaTheme="minorEastAsia" w:hAnsiTheme="minorHAnsi" w:cstheme="minorBidi"/>
+            <w:noProof/>
+            <w:kern w:val="2"/>
+            <w:sz w:val="28"/>
+            <w:szCs w:val="28"/>
+            <w14:ligatures w14:val="standardContextual"/>
+          </w:rPr>
+          <w:tab/>
+        </w:r>
+        <w:r>
+          <w:rPr>
+            <w:rStyle w:val="a5"/>
+            <w:noProof/>
+            <w:sz w:val="28"/>
+            <w:szCs w:val="28"/>
+          </w:rPr>
+          <w:t>Функция Лагранжа</w:t>
+        </w:r>
+        <w:r>
+          <w:rPr>
+            <w:noProof/>
+            <w:webHidden/>
+            <w:sz w:val="28"/>
+            <w:szCs w:val="28"/>
+          </w:rPr>
+          <w:tab/>
+        </w:r>
+        <w:r>
+          <w:rPr>
+            <w:noProof/>
+            <w:webHidden/>
+            <w:sz w:val="28"/>
+            <w:szCs w:val="28"/>
+          </w:rPr>
+          <w:fldChar w:fldCharType="begin"/>
+        </w:r>
+        <w:r>
+          <w:rPr>
+            <w:noProof/>
+            <w:webHidden/>
+            <w:sz w:val="28"/>
+            <w:szCs w:val="28"/>
+          </w:rPr>
+          <w:instrText xml:space="preserve"> PAGEREF _Toc232602891 \h </w:instrText>
+        </w:r>
+        <w:r>
+          <w:rPr>
+            <w:noProof/>
+            <w:webHidden/>
+            <w:sz w:val="28"/>
+            <w:szCs w:val="28"/>
+          </w:rPr>
+        </w:r>
+        <w:r>
+          <w:rPr>
+            <w:noProof/>
+            <w:webHidden/>
+            <w:sz w:val="28"/>
+            <w:szCs w:val="28"/>
+          </w:rPr>
+          <w:fldChar w:fldCharType="separate"/>
+        </w:r>
+        <w:r>
+          <w:rPr>
+            <w:noProof/>
+            <w:webHidden/>
+            <w:sz w:val="28"/>
+            <w:szCs w:val="28"/>
+          </w:rPr>
+          <w:t>3</w:t>
+        </w:r>
+        <w:r>
+          <w:rPr>
+            <w:noProof/>
+            <w:webHidden/>
+            <w:sz w:val="28"/>
+            <w:szCs w:val="28"/>
+          </w:rPr>
+          <w:fldChar w:fldCharType="end"/>
+        </w:r>
+      </w:hyperlink>
+    </w:p>
+    <w:p>
+      <w:pPr>
+        <w:pStyle w:val="21"/>
+        <w:tabs>
+          <w:tab w:val="left" w:pos="960"/>
+          <w:tab w:val="right" w:leader="dot" w:pos="9344"/>
+        </w:tabs>
+        <w:rPr>
+          <w:rFonts w:asciiTheme="minorHAnsi" w:eastAsiaTheme="minorEastAsia" w:hAnsiTheme="minorHAnsi" w:cstheme="minorBidi"/>
+          <w:noProof/>
+          <w:kern w:val="2"/>
+          <w:sz w:val="28"/>
+          <w:szCs w:val="28"/>
+          <w14:ligatures w14:val="standardContextual"/>
+        </w:rPr>
+      </w:pPr>
+      <w:hyperlink w:anchor="_Toc232602892" w:history="1">
+        <w:r>
+          <w:rPr>
+            <w:rStyle w:val="a5"/>
+            <w:noProof/>
+            <w:sz w:val="28"/>
+            <w:szCs w:val="28"/>
+          </w:rPr>
+          <w:t>3.2.</w:t>
+        </w:r>
+        <w:r>
+          <w:rPr>
+            <w:rFonts w:asciiTheme="minorHAnsi" w:eastAsiaTheme="minorEastAsia" w:hAnsiTheme="minorHAnsi" w:cstheme="minorBidi"/>
+            <w:noProof/>
+            <w:kern w:val="2"/>
+            <w:sz w:val="28"/>
+            <w:szCs w:val="28"/>
+            <w14:ligatures w14:val="standardContextual"/>
+          </w:rPr>
+          <w:tab/>
+        </w:r>
+        <w:r>
+          <w:rPr>
+            <w:rStyle w:val="a5"/>
+            <w:noProof/>
+            <w:sz w:val="28"/>
+            <w:szCs w:val="28"/>
+          </w:rPr>
+          <w:t>Необходимые условия первого порядка</w:t>
+        </w:r>
+        <w:r>
+          <w:rPr>
+            <w:noProof/>
+            <w:webHidden/>
+            <w:sz w:val="28"/>
+            <w:szCs w:val="28"/>
+          </w:rPr>
+          <w:tab/>
+        </w:r>
+        <w:r>
+          <w:rPr>
+            <w:noProof/>
+            <w:webHidden/>
+            <w:sz w:val="28"/>
+            <w:szCs w:val="28"/>
+          </w:rPr>
+          <w:fldChar w:fldCharType="begin"/>
+        </w:r>
+        <w:r>
+          <w:rPr>
+            <w:noProof/>
+            <w:webHidden/>
+            <w:sz w:val="28"/>
+            <w:szCs w:val="28"/>
+          </w:rPr>
+          <w:instrText xml:space="preserve"> PAGEREF _Toc232602892 \h </w:instrText>
+        </w:r>
+        <w:r>
+          <w:rPr>
+            <w:noProof/>
+            <w:webHidden/>
+            <w:sz w:val="28"/>
+            <w:szCs w:val="28"/>
+          </w:rPr>
+        </w:r>
+        <w:r>
+          <w:rPr>
+            <w:noProof/>
+            <w:webHidden/>
+            <w:sz w:val="28"/>
+            <w:szCs w:val="28"/>
+          </w:rPr>
+          <w:fldChar w:fldCharType="separate"/>
+        </w:r>
+        <w:r>
+          <w:rPr>
+            <w:noProof/>
+            <w:webHidden/>
+            <w:sz w:val="28"/>
+            <w:szCs w:val="28"/>
+          </w:rPr>
+          <w:t>3</w:t>
+        </w:r>
+        <w:r>
+          <w:rPr>
+            <w:noProof/>
+            <w:webHidden/>
+            <w:sz w:val="28"/>
+            <w:szCs w:val="28"/>
+          </w:rPr>
+          <w:fldChar w:fldCharType="end"/>
+        </w:r>
+      </w:hyperlink>
+    </w:p>
+    <w:p>
+      <w:pPr>
+        <w:pStyle w:val="21"/>
+        <w:tabs>
+          <w:tab w:val="left" w:pos="720"/>
+          <w:tab w:val="right" w:leader="dot" w:pos="9344"/>
+        </w:tabs>
+        <w:rPr>
+          <w:rFonts w:asciiTheme="minorHAnsi" w:eastAsiaTheme="minorEastAsia" w:hAnsiTheme="minorHAnsi" w:cstheme="minorBidi"/>
+          <w:noProof/>
+          <w:kern w:val="2"/>
+          <w:sz w:val="28"/>
+          <w:szCs w:val="28"/>
+          <w14:ligatures w14:val="standardContextual"/>
+        </w:rPr>
+      </w:pPr>
+      <w:hyperlink w:anchor="_Toc232602893" w:history="1">
         <w:r>
           <w:rPr>
             <w:rStyle w:val="a5"/>
@@ -1248,8 +1483,10 @@
           <w:rPr>
             <w:rFonts w:asciiTheme="minorHAnsi" w:eastAsiaTheme="minorEastAsia" w:hAnsiTheme="minorHAnsi" w:cstheme="minorBidi"/>
             <w:noProof/>
-            <w:sz w:val="28"/>
-            <w:szCs w:val="28"/>
+            <w:kern w:val="2"/>
+            <w:sz w:val="28"/>
+            <w:szCs w:val="28"/>
+            <w14:ligatures w14:val="standardContextual"/>
           </w:rPr>
           <w:tab/>
         </w:r>
@@ -1260,7 +1497,7 @@
             <w:sz w:val="28"/>
             <w:szCs w:val="28"/>
           </w:rPr>
-          <w:t>Листинг</w:t>
+          <w:t>Решение задачи</w:t>
         </w:r>
         <w:r>
           <w:rPr>
@@ -1287,7 +1524,7 @@
             <w:sz w:val="28"/>
             <w:szCs w:val="28"/>
           </w:rPr>
-          <w:instrText xml:space="preserve"> PAGEREF _Toc161683611 \h </w:instrText>
+          <w:instrText xml:space="preserve"> PAGEREF _Toc232602893 \h </w:instrText>
         </w:r>
         <w:r>
           <w:rPr>
@@ -1330,17 +1567,679 @@
       <w:pPr>
         <w:pStyle w:val="21"/>
         <w:tabs>
-          <w:tab w:val="left" w:pos="660"/>
+          <w:tab w:val="left" w:pos="960"/>
           <w:tab w:val="right" w:leader="dot" w:pos="9344"/>
         </w:tabs>
         <w:rPr>
           <w:rFonts w:asciiTheme="minorHAnsi" w:eastAsiaTheme="minorEastAsia" w:hAnsiTheme="minorHAnsi" w:cstheme="minorBidi"/>
           <w:noProof/>
-          <w:sz w:val="28"/>
-          <w:szCs w:val="28"/>
-        </w:rPr>
-      </w:pPr>
-      <w:hyperlink w:anchor="_Toc161683612" w:history="1">
+          <w:kern w:val="2"/>
+          <w:sz w:val="28"/>
+          <w:szCs w:val="28"/>
+          <w14:ligatures w14:val="standardContextual"/>
+        </w:rPr>
+      </w:pPr>
+      <w:hyperlink w:anchor="_Toc232602894" w:history="1">
+        <w:r>
+          <w:rPr>
+            <w:rStyle w:val="a5"/>
+            <w:noProof/>
+            <w:sz w:val="28"/>
+            <w:szCs w:val="28"/>
+          </w:rPr>
+          <w:t>4.1.</w:t>
+        </w:r>
+        <w:r>
+          <w:rPr>
+            <w:rFonts w:asciiTheme="minorHAnsi" w:eastAsiaTheme="minorEastAsia" w:hAnsiTheme="minorHAnsi" w:cstheme="minorBidi"/>
+            <w:noProof/>
+            <w:kern w:val="2"/>
+            <w:sz w:val="28"/>
+            <w:szCs w:val="28"/>
+            <w14:ligatures w14:val="standardContextual"/>
+          </w:rPr>
+          <w:tab/>
+        </w:r>
+        <w:r>
+          <w:rPr>
+            <w:rStyle w:val="a5"/>
+            <w:noProof/>
+            <w:sz w:val="28"/>
+            <w:szCs w:val="28"/>
+          </w:rPr>
+          <w:t>Нахождение стационарных точек</w:t>
+        </w:r>
+        <w:r>
+          <w:rPr>
+            <w:noProof/>
+            <w:webHidden/>
+            <w:sz w:val="28"/>
+            <w:szCs w:val="28"/>
+          </w:rPr>
+          <w:tab/>
+        </w:r>
+        <w:r>
+          <w:rPr>
+            <w:noProof/>
+            <w:webHidden/>
+            <w:sz w:val="28"/>
+            <w:szCs w:val="28"/>
+          </w:rPr>
+          <w:fldChar w:fldCharType="begin"/>
+        </w:r>
+        <w:r>
+          <w:rPr>
+            <w:noProof/>
+            <w:webHidden/>
+            <w:sz w:val="28"/>
+            <w:szCs w:val="28"/>
+          </w:rPr>
+          <w:instrText xml:space="preserve"> PAGEREF _Toc232602894 \h </w:instrText>
+        </w:r>
+        <w:r>
+          <w:rPr>
+            <w:noProof/>
+            <w:webHidden/>
+            <w:sz w:val="28"/>
+            <w:szCs w:val="28"/>
+          </w:rPr>
+        </w:r>
+        <w:r>
+          <w:rPr>
+            <w:noProof/>
+            <w:webHidden/>
+            <w:sz w:val="28"/>
+            <w:szCs w:val="28"/>
+          </w:rPr>
+          <w:fldChar w:fldCharType="separate"/>
+        </w:r>
+        <w:r>
+          <w:rPr>
+            <w:noProof/>
+            <w:webHidden/>
+            <w:sz w:val="28"/>
+            <w:szCs w:val="28"/>
+          </w:rPr>
+          <w:t>4</w:t>
+        </w:r>
+        <w:r>
+          <w:rPr>
+            <w:noProof/>
+            <w:webHidden/>
+            <w:sz w:val="28"/>
+            <w:szCs w:val="28"/>
+          </w:rPr>
+          <w:fldChar w:fldCharType="end"/>
+        </w:r>
+      </w:hyperlink>
+    </w:p>
+    <w:p>
+      <w:pPr>
+        <w:pStyle w:val="21"/>
+        <w:tabs>
+          <w:tab w:val="left" w:pos="960"/>
+          <w:tab w:val="right" w:leader="dot" w:pos="9344"/>
+        </w:tabs>
+        <w:rPr>
+          <w:rFonts w:asciiTheme="minorHAnsi" w:eastAsiaTheme="minorEastAsia" w:hAnsiTheme="minorHAnsi" w:cstheme="minorBidi"/>
+          <w:noProof/>
+          <w:kern w:val="2"/>
+          <w:sz w:val="28"/>
+          <w:szCs w:val="28"/>
+          <w14:ligatures w14:val="standardContextual"/>
+        </w:rPr>
+      </w:pPr>
+      <w:hyperlink w:anchor="_Toc232602895" w:history="1">
+        <w:r>
+          <w:rPr>
+            <w:rStyle w:val="a5"/>
+            <w:noProof/>
+            <w:sz w:val="28"/>
+            <w:szCs w:val="28"/>
+          </w:rPr>
+          <w:t>4.2.</w:t>
+        </w:r>
+        <w:r>
+          <w:rPr>
+            <w:rFonts w:asciiTheme="minorHAnsi" w:eastAsiaTheme="minorEastAsia" w:hAnsiTheme="minorHAnsi" w:cstheme="minorBidi"/>
+            <w:noProof/>
+            <w:kern w:val="2"/>
+            <w:sz w:val="28"/>
+            <w:szCs w:val="28"/>
+            <w14:ligatures w14:val="standardContextual"/>
+          </w:rPr>
+          <w:tab/>
+        </w:r>
+        <w:r>
+          <w:rPr>
+            <w:rStyle w:val="a5"/>
+            <w:noProof/>
+            <w:sz w:val="28"/>
+            <w:szCs w:val="28"/>
+          </w:rPr>
+          <w:t>Проверка допустимости</w:t>
+        </w:r>
+        <w:r>
+          <w:rPr>
+            <w:noProof/>
+            <w:webHidden/>
+            <w:sz w:val="28"/>
+            <w:szCs w:val="28"/>
+          </w:rPr>
+          <w:tab/>
+        </w:r>
+        <w:r>
+          <w:rPr>
+            <w:noProof/>
+            <w:webHidden/>
+            <w:sz w:val="28"/>
+            <w:szCs w:val="28"/>
+          </w:rPr>
+          <w:fldChar w:fldCharType="begin"/>
+        </w:r>
+        <w:r>
+          <w:rPr>
+            <w:noProof/>
+            <w:webHidden/>
+            <w:sz w:val="28"/>
+            <w:szCs w:val="28"/>
+          </w:rPr>
+          <w:instrText xml:space="preserve"> PAGEREF _Toc232602895 \h </w:instrText>
+        </w:r>
+        <w:r>
+          <w:rPr>
+            <w:noProof/>
+            <w:webHidden/>
+            <w:sz w:val="28"/>
+            <w:szCs w:val="28"/>
+          </w:rPr>
+        </w:r>
+        <w:r>
+          <w:rPr>
+            <w:noProof/>
+            <w:webHidden/>
+            <w:sz w:val="28"/>
+            <w:szCs w:val="28"/>
+          </w:rPr>
+          <w:fldChar w:fldCharType="separate"/>
+        </w:r>
+        <w:r>
+          <w:rPr>
+            <w:noProof/>
+            <w:webHidden/>
+            <w:sz w:val="28"/>
+            <w:szCs w:val="28"/>
+          </w:rPr>
+          <w:t>4</w:t>
+        </w:r>
+        <w:r>
+          <w:rPr>
+            <w:noProof/>
+            <w:webHidden/>
+            <w:sz w:val="28"/>
+            <w:szCs w:val="28"/>
+          </w:rPr>
+          <w:fldChar w:fldCharType="end"/>
+        </w:r>
+      </w:hyperlink>
+    </w:p>
+    <w:p>
+      <w:pPr>
+        <w:pStyle w:val="21"/>
+        <w:tabs>
+          <w:tab w:val="left" w:pos="960"/>
+          <w:tab w:val="right" w:leader="dot" w:pos="9344"/>
+        </w:tabs>
+        <w:rPr>
+          <w:rFonts w:asciiTheme="minorHAnsi" w:eastAsiaTheme="minorEastAsia" w:hAnsiTheme="minorHAnsi" w:cstheme="minorBidi"/>
+          <w:noProof/>
+          <w:kern w:val="2"/>
+          <w:sz w:val="28"/>
+          <w:szCs w:val="28"/>
+          <w14:ligatures w14:val="standardContextual"/>
+        </w:rPr>
+      </w:pPr>
+      <w:hyperlink w:anchor="_Toc232602896" w:history="1">
+        <w:r>
+          <w:rPr>
+            <w:rStyle w:val="a5"/>
+            <w:noProof/>
+            <w:sz w:val="28"/>
+            <w:szCs w:val="28"/>
+          </w:rPr>
+          <w:t>4.3.</w:t>
+        </w:r>
+        <w:r>
+          <w:rPr>
+            <w:rFonts w:asciiTheme="minorHAnsi" w:eastAsiaTheme="minorEastAsia" w:hAnsiTheme="minorHAnsi" w:cstheme="minorBidi"/>
+            <w:noProof/>
+            <w:kern w:val="2"/>
+            <w:sz w:val="28"/>
+            <w:szCs w:val="28"/>
+            <w14:ligatures w14:val="standardContextual"/>
+          </w:rPr>
+          <w:tab/>
+        </w:r>
+        <w:r>
+          <w:rPr>
+            <w:rStyle w:val="a5"/>
+            <w:noProof/>
+            <w:sz w:val="28"/>
+            <w:szCs w:val="28"/>
+          </w:rPr>
+          <w:t>Матрица Гессе функции Лагранжа</w:t>
+        </w:r>
+        <w:r>
+          <w:rPr>
+            <w:noProof/>
+            <w:webHidden/>
+            <w:sz w:val="28"/>
+            <w:szCs w:val="28"/>
+          </w:rPr>
+          <w:tab/>
+        </w:r>
+        <w:r>
+          <w:rPr>
+            <w:noProof/>
+            <w:webHidden/>
+            <w:sz w:val="28"/>
+            <w:szCs w:val="28"/>
+          </w:rPr>
+          <w:fldChar w:fldCharType="begin"/>
+        </w:r>
+        <w:r>
+          <w:rPr>
+            <w:noProof/>
+            <w:webHidden/>
+            <w:sz w:val="28"/>
+            <w:szCs w:val="28"/>
+          </w:rPr>
+          <w:instrText xml:space="preserve"> PAGEREF _Toc232602896 \h </w:instrText>
+        </w:r>
+        <w:r>
+          <w:rPr>
+            <w:noProof/>
+            <w:webHidden/>
+            <w:sz w:val="28"/>
+            <w:szCs w:val="28"/>
+          </w:rPr>
+        </w:r>
+        <w:r>
+          <w:rPr>
+            <w:noProof/>
+            <w:webHidden/>
+            <w:sz w:val="28"/>
+            <w:szCs w:val="28"/>
+          </w:rPr>
+          <w:fldChar w:fldCharType="separate"/>
+        </w:r>
+        <w:r>
+          <w:rPr>
+            <w:noProof/>
+            <w:webHidden/>
+            <w:sz w:val="28"/>
+            <w:szCs w:val="28"/>
+          </w:rPr>
+          <w:t>5</w:t>
+        </w:r>
+        <w:r>
+          <w:rPr>
+            <w:noProof/>
+            <w:webHidden/>
+            <w:sz w:val="28"/>
+            <w:szCs w:val="28"/>
+          </w:rPr>
+          <w:fldChar w:fldCharType="end"/>
+        </w:r>
+      </w:hyperlink>
+    </w:p>
+    <w:p>
+      <w:pPr>
+        <w:pStyle w:val="21"/>
+        <w:tabs>
+          <w:tab w:val="left" w:pos="960"/>
+          <w:tab w:val="right" w:leader="dot" w:pos="9344"/>
+        </w:tabs>
+        <w:rPr>
+          <w:rFonts w:asciiTheme="minorHAnsi" w:eastAsiaTheme="minorEastAsia" w:hAnsiTheme="minorHAnsi" w:cstheme="minorBidi"/>
+          <w:noProof/>
+          <w:kern w:val="2"/>
+          <w:sz w:val="28"/>
+          <w:szCs w:val="28"/>
+          <w14:ligatures w14:val="standardContextual"/>
+        </w:rPr>
+      </w:pPr>
+      <w:hyperlink w:anchor="_Toc232602897" w:history="1">
+        <w:r>
+          <w:rPr>
+            <w:rStyle w:val="a5"/>
+            <w:noProof/>
+            <w:sz w:val="28"/>
+            <w:szCs w:val="28"/>
+          </w:rPr>
+          <w:t>4.4.</w:t>
+        </w:r>
+        <w:r>
+          <w:rPr>
+            <w:rFonts w:asciiTheme="minorHAnsi" w:eastAsiaTheme="minorEastAsia" w:hAnsiTheme="minorHAnsi" w:cstheme="minorBidi"/>
+            <w:noProof/>
+            <w:kern w:val="2"/>
+            <w:sz w:val="28"/>
+            <w:szCs w:val="28"/>
+            <w14:ligatures w14:val="standardContextual"/>
+          </w:rPr>
+          <w:tab/>
+        </w:r>
+        <w:r>
+          <w:rPr>
+            <w:rStyle w:val="a5"/>
+            <w:noProof/>
+            <w:sz w:val="28"/>
+            <w:szCs w:val="28"/>
+          </w:rPr>
+          <w:t>Проверка достаточных условий второго порядка</w:t>
+        </w:r>
+        <w:r>
+          <w:rPr>
+            <w:noProof/>
+            <w:webHidden/>
+            <w:sz w:val="28"/>
+            <w:szCs w:val="28"/>
+          </w:rPr>
+          <w:tab/>
+        </w:r>
+        <w:r>
+          <w:rPr>
+            <w:noProof/>
+            <w:webHidden/>
+            <w:sz w:val="28"/>
+            <w:szCs w:val="28"/>
+          </w:rPr>
+          <w:fldChar w:fldCharType="begin"/>
+        </w:r>
+        <w:r>
+          <w:rPr>
+            <w:noProof/>
+            <w:webHidden/>
+            <w:sz w:val="28"/>
+            <w:szCs w:val="28"/>
+          </w:rPr>
+          <w:instrText xml:space="preserve"> PAGEREF _Toc232602897 \h </w:instrText>
+        </w:r>
+        <w:r>
+          <w:rPr>
+            <w:noProof/>
+            <w:webHidden/>
+            <w:sz w:val="28"/>
+            <w:szCs w:val="28"/>
+          </w:rPr>
+        </w:r>
+        <w:r>
+          <w:rPr>
+            <w:noProof/>
+            <w:webHidden/>
+            <w:sz w:val="28"/>
+            <w:szCs w:val="28"/>
+          </w:rPr>
+          <w:fldChar w:fldCharType="separate"/>
+        </w:r>
+        <w:r>
+          <w:rPr>
+            <w:noProof/>
+            <w:webHidden/>
+            <w:sz w:val="28"/>
+            <w:szCs w:val="28"/>
+          </w:rPr>
+          <w:t>5</w:t>
+        </w:r>
+        <w:r>
+          <w:rPr>
+            <w:noProof/>
+            <w:webHidden/>
+            <w:sz w:val="28"/>
+            <w:szCs w:val="28"/>
+          </w:rPr>
+          <w:fldChar w:fldCharType="end"/>
+        </w:r>
+      </w:hyperlink>
+    </w:p>
+    <w:p>
+      <w:pPr>
+        <w:pStyle w:val="21"/>
+        <w:tabs>
+          <w:tab w:val="left" w:pos="960"/>
+          <w:tab w:val="right" w:leader="dot" w:pos="9344"/>
+        </w:tabs>
+        <w:rPr>
+          <w:rFonts w:asciiTheme="minorHAnsi" w:eastAsiaTheme="minorEastAsia" w:hAnsiTheme="minorHAnsi" w:cstheme="minorBidi"/>
+          <w:noProof/>
+          <w:kern w:val="2"/>
+          <w:sz w:val="28"/>
+          <w:szCs w:val="28"/>
+          <w14:ligatures w14:val="standardContextual"/>
+        </w:rPr>
+      </w:pPr>
+      <w:hyperlink w:anchor="_Toc232602898" w:history="1">
+        <w:r>
+          <w:rPr>
+            <w:rStyle w:val="a5"/>
+            <w:noProof/>
+            <w:sz w:val="28"/>
+            <w:szCs w:val="28"/>
+          </w:rPr>
+          <w:t>4.5.</w:t>
+        </w:r>
+        <w:r>
+          <w:rPr>
+            <w:rFonts w:asciiTheme="minorHAnsi" w:eastAsiaTheme="minorEastAsia" w:hAnsiTheme="minorHAnsi" w:cstheme="minorBidi"/>
+            <w:noProof/>
+            <w:kern w:val="2"/>
+            <w:sz w:val="28"/>
+            <w:szCs w:val="28"/>
+            <w14:ligatures w14:val="standardContextual"/>
+          </w:rPr>
+          <w:tab/>
+        </w:r>
+        <w:r>
+          <w:rPr>
+            <w:rStyle w:val="a5"/>
+            <w:noProof/>
+            <w:sz w:val="28"/>
+            <w:szCs w:val="28"/>
+          </w:rPr>
+          <w:t>Графическое представление</w:t>
+        </w:r>
+        <w:r>
+          <w:rPr>
+            <w:noProof/>
+            <w:webHidden/>
+            <w:sz w:val="28"/>
+            <w:szCs w:val="28"/>
+          </w:rPr>
+          <w:tab/>
+        </w:r>
+        <w:r>
+          <w:rPr>
+            <w:noProof/>
+            <w:webHidden/>
+            <w:sz w:val="28"/>
+            <w:szCs w:val="28"/>
+          </w:rPr>
+          <w:fldChar w:fldCharType="begin"/>
+        </w:r>
+        <w:r>
+          <w:rPr>
+            <w:noProof/>
+            <w:webHidden/>
+            <w:sz w:val="28"/>
+            <w:szCs w:val="28"/>
+          </w:rPr>
+          <w:instrText xml:space="preserve"> PAGEREF _Toc232602898 \h </w:instrText>
+        </w:r>
+        <w:r>
+          <w:rPr>
+            <w:noProof/>
+            <w:webHidden/>
+            <w:sz w:val="28"/>
+            <w:szCs w:val="28"/>
+          </w:rPr>
+        </w:r>
+        <w:r>
+          <w:rPr>
+            <w:noProof/>
+            <w:webHidden/>
+            <w:sz w:val="28"/>
+            <w:szCs w:val="28"/>
+          </w:rPr>
+          <w:fldChar w:fldCharType="separate"/>
+        </w:r>
+        <w:r>
+          <w:rPr>
+            <w:noProof/>
+            <w:webHidden/>
+            <w:sz w:val="28"/>
+            <w:szCs w:val="28"/>
+          </w:rPr>
+          <w:t>6</w:t>
+        </w:r>
+        <w:r>
+          <w:rPr>
+            <w:noProof/>
+            <w:webHidden/>
+            <w:sz w:val="28"/>
+            <w:szCs w:val="28"/>
+          </w:rPr>
+          <w:fldChar w:fldCharType="end"/>
+        </w:r>
+      </w:hyperlink>
+    </w:p>
+    <w:p>
+      <w:pPr>
+        <w:pStyle w:val="21"/>
+        <w:tabs>
+          <w:tab w:val="left" w:pos="960"/>
+          <w:tab w:val="right" w:leader="dot" w:pos="9344"/>
+        </w:tabs>
+        <w:rPr>
+          <w:rFonts w:asciiTheme="minorHAnsi" w:eastAsiaTheme="minorEastAsia" w:hAnsiTheme="minorHAnsi" w:cstheme="minorBidi"/>
+          <w:noProof/>
+          <w:kern w:val="2"/>
+          <w:sz w:val="28"/>
+          <w:szCs w:val="28"/>
+          <w14:ligatures w14:val="standardContextual"/>
+        </w:rPr>
+      </w:pPr>
+      <w:hyperlink w:anchor="_Toc232602899" w:history="1">
+        <w:r>
+          <w:rPr>
+            <w:rStyle w:val="a5"/>
+            <w:noProof/>
+            <w:sz w:val="28"/>
+            <w:szCs w:val="28"/>
+          </w:rPr>
+          <w:t>4.6.</w:t>
+        </w:r>
+        <w:r>
+          <w:rPr>
+            <w:rFonts w:asciiTheme="minorHAnsi" w:eastAsiaTheme="minorEastAsia" w:hAnsiTheme="minorHAnsi" w:cstheme="minorBidi"/>
+            <w:noProof/>
+            <w:kern w:val="2"/>
+            <w:sz w:val="28"/>
+            <w:szCs w:val="28"/>
+            <w14:ligatures w14:val="standardContextual"/>
+          </w:rPr>
+          <w:tab/>
+        </w:r>
+        <w:r>
+          <w:rPr>
+            <w:rStyle w:val="a5"/>
+            <w:noProof/>
+            <w:sz w:val="28"/>
+            <w:szCs w:val="28"/>
+          </w:rPr>
+          <w:t>Итоговый вывод</w:t>
+        </w:r>
+        <w:r>
+          <w:rPr>
+            <w:noProof/>
+            <w:webHidden/>
+            <w:sz w:val="28"/>
+            <w:szCs w:val="28"/>
+          </w:rPr>
+          <w:tab/>
+        </w:r>
+        <w:r>
+          <w:rPr>
+            <w:noProof/>
+            <w:webHidden/>
+            <w:sz w:val="28"/>
+            <w:szCs w:val="28"/>
+          </w:rPr>
+          <w:fldChar w:fldCharType="begin"/>
+        </w:r>
+        <w:r>
+          <w:rPr>
+            <w:noProof/>
+            <w:webHidden/>
+            <w:sz w:val="28"/>
+            <w:szCs w:val="28"/>
+          </w:rPr>
+          <w:instrText xml:space="preserve"> PAGEREF _Toc232602899 \h </w:instrText>
+        </w:r>
+        <w:r>
+          <w:rPr>
+            <w:noProof/>
+            <w:webHidden/>
+            <w:sz w:val="28"/>
+            <w:szCs w:val="28"/>
+          </w:rPr>
+        </w:r>
+        <w:r>
+          <w:rPr>
+            <w:noProof/>
+            <w:webHidden/>
+            <w:sz w:val="28"/>
+            <w:szCs w:val="28"/>
+          </w:rPr>
+          <w:fldChar w:fldCharType="separate"/>
+        </w:r>
+        <w:r>
+          <w:rPr>
+            <w:noProof/>
+            <w:webHidden/>
+            <w:sz w:val="28"/>
+            <w:szCs w:val="28"/>
+          </w:rPr>
+          <w:t>7</w:t>
+        </w:r>
+        <w:r>
+          <w:rPr>
+            <w:noProof/>
+            <w:webHidden/>
+            <w:sz w:val="28"/>
+            <w:szCs w:val="28"/>
+          </w:rPr>
+          <w:fldChar w:fldCharType="end"/>
+        </w:r>
+      </w:hyperlink>
+    </w:p>
+    <w:p>
+      <w:pPr>
+        <w:pStyle w:val="21"/>
+        <w:tabs>
+          <w:tab w:val="left" w:pos="720"/>
+          <w:tab w:val="right" w:leader="dot" w:pos="9344"/>
+        </w:tabs>
+        <w:rPr>
+          <w:rFonts w:asciiTheme="minorHAnsi" w:eastAsiaTheme="minorEastAsia" w:hAnsiTheme="minorHAnsi" w:cstheme="minorBidi"/>
+          <w:noProof/>
+          <w:kern w:val="2"/>
+          <w:sz w:val="28"/>
+          <w:szCs w:val="28"/>
+          <w14:ligatures w14:val="standardContextual"/>
+        </w:rPr>
+      </w:pPr>
+      <w:hyperlink w:anchor="_Toc232602900" w:history="1">
         <w:r>
           <w:rPr>
             <w:rStyle w:val="a5"/>
@@ -1354,8 +2253,10 @@
           <w:rPr>
             <w:rFonts w:asciiTheme="minorHAnsi" w:eastAsiaTheme="minorEastAsia" w:hAnsiTheme="minorHAnsi" w:cstheme="minorBidi"/>
             <w:noProof/>
-            <w:sz w:val="28"/>
-            <w:szCs w:val="28"/>
+            <w:kern w:val="2"/>
+            <w:sz w:val="28"/>
+            <w:szCs w:val="28"/>
+            <w14:ligatures w14:val="standardContextual"/>
           </w:rPr>
           <w:tab/>
         </w:r>
@@ -1393,7 +2294,7 @@
             <w:sz w:val="28"/>
             <w:szCs w:val="28"/>
           </w:rPr>
-          <w:instrText xml:space="preserve"> PAGEREF _Toc161683612 \h </w:instrText>
+          <w:instrText xml:space="preserve"> PAGEREF _Toc232602900 \h </w:instrText>
         </w:r>
         <w:r>
           <w:rPr>
@@ -1419,7 +2320,7 @@
             <w:sz w:val="28"/>
             <w:szCs w:val="28"/>
           </w:rPr>
-          <w:t>28</w:t>
+          <w:t>8</w:t>
         </w:r>
         <w:r>
           <w:rPr>
@@ -1475,7 +2376,7 @@
         </w:rPr>
       </w:pPr>
       <w:bookmarkStart w:id="1" w:name="_Toc101095180"/>
-      <w:bookmarkStart w:id="2" w:name="_Toc161683608"/>
+      <w:bookmarkStart w:id="2" w:name="_Toc232602888"/>
       <w:r>
         <w:rPr>
           <w:rFonts w:ascii="Times New Roman" w:hAnsi="Times New Roman" w:cs="Times New Roman"/>
@@ -1527,7 +2428,7 @@
           <w:szCs w:val="28"/>
         </w:rPr>
       </w:pPr>
-      <w:bookmarkStart w:id="3" w:name="_Toc161683609"/>
+      <w:bookmarkStart w:id="3" w:name="_Toc232602889"/>
       <w:r>
         <w:rPr>
           <w:rFonts w:ascii="Times New Roman" w:hAnsi="Times New Roman" w:cs="Times New Roman"/>
@@ -2336,7 +3237,7 @@
         </w:rPr>
       </w:pPr>
       <w:bookmarkStart w:id="4" w:name="_Toc7"/>
-      <w:bookmarkStart w:id="5" w:name="_Toc161683610"/>
+      <w:bookmarkStart w:id="5" w:name="_Toc232602890"/>
       <w:r>
         <w:rPr>
           <w:rFonts w:ascii="Times New Roman" w:hAnsi="Times New Roman" w:cs="Times New Roman"/>
@@ -2377,6 +3278,7 @@
         </w:rPr>
         <w:t xml:space="preserve"> </w:t>
       </w:r>
+      <w:bookmarkStart w:id="6" w:name="_Toc232602891"/>
       <w:r>
         <w:rPr>
           <w:rFonts w:ascii="Times New Roman" w:hAnsi="Times New Roman" w:cs="Times New Roman"/>
@@ -2386,6 +3288,7 @@
         </w:rPr>
         <w:t>Функция Лагранжа</w:t>
       </w:r>
+      <w:bookmarkEnd w:id="6"/>
     </w:p>
     <w:p>
       <w:pPr>
@@ -3634,6 +4537,7 @@
         </w:rPr>
         <w:t xml:space="preserve"> </w:t>
       </w:r>
+      <w:bookmarkStart w:id="7" w:name="_Toc232602892"/>
       <w:r>
         <w:rPr>
           <w:rFonts w:ascii="Times New Roman" w:hAnsi="Times New Roman" w:cs="Times New Roman"/>
@@ -3643,6 +4547,7 @@
         </w:rPr>
         <w:t>Необходимые условия первого порядка</w:t>
       </w:r>
+      <w:bookmarkEnd w:id="7"/>
     </w:p>
     <w:p>
       <w:pPr>
@@ -5264,7 +6169,7 @@
           <w:szCs w:val="28"/>
         </w:rPr>
       </w:pPr>
-      <w:bookmarkStart w:id="6" w:name="_Toc161683611"/>
+      <w:bookmarkStart w:id="8" w:name="_Toc232602893"/>
       <w:r>
         <w:rPr>
           <w:rFonts w:ascii="Times New Roman" w:hAnsi="Times New Roman" w:cs="Times New Roman"/>
@@ -5274,31 +6179,38 @@
         </w:rPr>
         <w:t>Решение задачи</w:t>
       </w:r>
-      <w:bookmarkEnd w:id="6"/>
-    </w:p>
-    <w:p>
-      <w:pPr>
-        <w:pStyle w:val="a6"/>
+      <w:bookmarkEnd w:id="8"/>
+    </w:p>
+    <w:p>
+      <w:pPr>
+        <w:pStyle w:val="2"/>
+        <w:widowControl/>
         <w:numPr>
           <w:ilvl w:val="1"/>
           <w:numId w:val="1"/>
         </w:numPr>
-        <w:spacing w:line="360" w:lineRule="auto"/>
+        <w:autoSpaceDE/>
+        <w:autoSpaceDN/>
+        <w:spacing w:before="40" w:line="360" w:lineRule="auto"/>
         <w:jc w:val="both"/>
         <w:rPr>
-          <w:b/>
-          <w:sz w:val="28"/>
-          <w:szCs w:val="28"/>
-        </w:rPr>
-      </w:pPr>
-      <w:r>
-        <w:rPr>
-          <w:b/>
+          <w:rFonts w:ascii="Times New Roman" w:hAnsi="Times New Roman" w:cs="Times New Roman"/>
+          <w:color w:val="auto"/>
+          <w:sz w:val="28"/>
+          <w:szCs w:val="28"/>
+        </w:rPr>
+      </w:pPr>
+      <w:bookmarkStart w:id="9" w:name="_Toc232602894"/>
+      <w:r>
+        <w:rPr>
+          <w:rFonts w:ascii="Times New Roman" w:hAnsi="Times New Roman" w:cs="Times New Roman"/>
+          <w:color w:val="auto"/>
           <w:sz w:val="28"/>
           <w:szCs w:val="28"/>
         </w:rPr>
         <w:t>Нахождение стационарных точек</w:t>
       </w:r>
+      <w:bookmarkEnd w:id="9"/>
     </w:p>
     <w:p>
       <w:pPr>
@@ -6581,37 +7493,43 @@
     </w:p>
     <w:p>
       <w:pPr>
-        <w:pStyle w:val="a6"/>
+        <w:pStyle w:val="2"/>
+        <w:widowControl/>
         <w:numPr>
           <w:ilvl w:val="1"/>
           <w:numId w:val="1"/>
         </w:numPr>
-        <w:spacing w:line="360" w:lineRule="auto"/>
+        <w:autoSpaceDE/>
+        <w:autoSpaceDN/>
+        <w:spacing w:before="40" w:line="360" w:lineRule="auto"/>
         <w:jc w:val="both"/>
         <w:rPr>
-          <w:b/>
-          <w:sz w:val="28"/>
-          <w:szCs w:val="28"/>
-        </w:rPr>
-      </w:pPr>
-      <w:r>
-        <w:rPr>
-          <w:b/>
-          <w:sz w:val="28"/>
-          <w:szCs w:val="28"/>
-          <w:lang w:val="en-US"/>
+          <w:rFonts w:ascii="Times New Roman" w:hAnsi="Times New Roman" w:cs="Times New Roman"/>
+          <w:color w:val="auto"/>
+          <w:sz w:val="28"/>
+          <w:szCs w:val="28"/>
+        </w:rPr>
+      </w:pPr>
+      <w:r>
+        <w:rPr>
+          <w:rFonts w:ascii="Times New Roman" w:hAnsi="Times New Roman" w:cs="Times New Roman"/>
+          <w:color w:val="auto"/>
+          <w:sz w:val="28"/>
+          <w:szCs w:val="28"/>
         </w:rPr>
         <w:t xml:space="preserve"> </w:t>
       </w:r>
-      <w:r>
-        <w:rPr>
-          <w:b/>
-          <w:sz w:val="28"/>
-          <w:szCs w:val="28"/>
-          <w:lang w:val="en-US"/>
+      <w:bookmarkStart w:id="10" w:name="_Toc232602895"/>
+      <w:r>
+        <w:rPr>
+          <w:rFonts w:ascii="Times New Roman" w:hAnsi="Times New Roman" w:cs="Times New Roman"/>
+          <w:color w:val="auto"/>
+          <w:sz w:val="28"/>
+          <w:szCs w:val="28"/>
         </w:rPr>
         <w:t>Проверка допустимости</w:t>
       </w:r>
+      <w:bookmarkEnd w:id="10"/>
     </w:p>
     <w:p>
       <w:pPr>
@@ -7286,36 +8204,43 @@
     </w:p>
     <w:p>
       <w:pPr>
-        <w:pStyle w:val="a6"/>
+        <w:pStyle w:val="2"/>
+        <w:widowControl/>
         <w:numPr>
           <w:ilvl w:val="1"/>
           <w:numId w:val="1"/>
         </w:numPr>
-        <w:spacing w:line="360" w:lineRule="auto"/>
+        <w:autoSpaceDE/>
+        <w:autoSpaceDN/>
+        <w:spacing w:before="40" w:line="360" w:lineRule="auto"/>
         <w:jc w:val="both"/>
         <w:rPr>
-          <w:b/>
-          <w:sz w:val="28"/>
-          <w:szCs w:val="28"/>
-        </w:rPr>
-      </w:pPr>
-      <w:r>
-        <w:rPr>
-          <w:b/>
-          <w:sz w:val="28"/>
-          <w:szCs w:val="28"/>
-          <w:lang w:val="en-US"/>
+          <w:rFonts w:ascii="Times New Roman" w:hAnsi="Times New Roman" w:cs="Times New Roman"/>
+          <w:color w:val="auto"/>
+          <w:sz w:val="28"/>
+          <w:szCs w:val="28"/>
+        </w:rPr>
+      </w:pPr>
+      <w:r>
+        <w:rPr>
+          <w:rFonts w:ascii="Times New Roman" w:hAnsi="Times New Roman" w:cs="Times New Roman"/>
+          <w:color w:val="auto"/>
+          <w:sz w:val="28"/>
+          <w:szCs w:val="28"/>
         </w:rPr>
         <w:t xml:space="preserve"> </w:t>
       </w:r>
-      <w:r>
-        <w:rPr>
-          <w:b/>
+      <w:bookmarkStart w:id="11" w:name="_Toc232602896"/>
+      <w:r>
+        <w:rPr>
+          <w:rFonts w:ascii="Times New Roman" w:hAnsi="Times New Roman" w:cs="Times New Roman"/>
+          <w:color w:val="auto"/>
           <w:sz w:val="28"/>
           <w:szCs w:val="28"/>
         </w:rPr>
         <w:t>Матрица Гессе функции Лагранжа</w:t>
       </w:r>
+      <w:bookmarkEnd w:id="11"/>
     </w:p>
     <w:p>
       <w:pPr>
@@ -7332,6 +8257,7 @@
       <w:r>
         <w:rPr>
           <w:b/>
+          <w:noProof/>
           <w:sz w:val="28"/>
           <w:szCs w:val="28"/>
         </w:rPr>
@@ -7374,27 +8300,34 @@
     </w:p>
     <w:p>
       <w:pPr>
-        <w:pStyle w:val="a6"/>
+        <w:pStyle w:val="2"/>
+        <w:widowControl/>
         <w:numPr>
           <w:ilvl w:val="1"/>
           <w:numId w:val="1"/>
         </w:numPr>
-        <w:spacing w:line="360" w:lineRule="auto"/>
+        <w:autoSpaceDE/>
+        <w:autoSpaceDN/>
+        <w:spacing w:before="40" w:line="360" w:lineRule="auto"/>
         <w:jc w:val="both"/>
         <w:rPr>
-          <w:b/>
-          <w:sz w:val="28"/>
-          <w:szCs w:val="28"/>
-        </w:rPr>
-      </w:pPr>
-      <w:r>
-        <w:rPr>
-          <w:b/>
+          <w:rFonts w:ascii="Times New Roman" w:hAnsi="Times New Roman" w:cs="Times New Roman"/>
+          <w:color w:val="auto"/>
+          <w:sz w:val="28"/>
+          <w:szCs w:val="28"/>
+        </w:rPr>
+      </w:pPr>
+      <w:bookmarkStart w:id="12" w:name="_Toc232602897"/>
+      <w:r>
+        <w:rPr>
+          <w:rFonts w:ascii="Times New Roman" w:hAnsi="Times New Roman" w:cs="Times New Roman"/>
+          <w:color w:val="auto"/>
           <w:sz w:val="28"/>
           <w:szCs w:val="28"/>
         </w:rPr>
         <w:t>Проверка достаточных условий второго порядка</w:t>
       </w:r>
+      <w:bookmarkEnd w:id="12"/>
     </w:p>
     <w:p>
       <w:pPr>
@@ -7411,6 +8344,7 @@
       <w:r>
         <w:rPr>
           <w:b/>
+          <w:noProof/>
           <w:sz w:val="28"/>
           <w:szCs w:val="28"/>
         </w:rPr>
@@ -7474,28 +8408,35 @@
     </w:p>
     <w:p>
       <w:pPr>
-        <w:pStyle w:val="a6"/>
+        <w:pStyle w:val="2"/>
+        <w:widowControl/>
         <w:numPr>
           <w:ilvl w:val="1"/>
           <w:numId w:val="1"/>
         </w:numPr>
-        <w:spacing w:line="360" w:lineRule="auto"/>
+        <w:autoSpaceDE/>
+        <w:autoSpaceDN/>
+        <w:spacing w:before="40" w:line="360" w:lineRule="auto"/>
         <w:jc w:val="both"/>
         <w:rPr>
-          <w:b/>
-          <w:sz w:val="28"/>
-          <w:szCs w:val="28"/>
-        </w:rPr>
-      </w:pPr>
-      <w:r>
-        <w:rPr>
-          <w:b/>
+          <w:rFonts w:ascii="Times New Roman" w:hAnsi="Times New Roman" w:cs="Times New Roman"/>
+          <w:color w:val="auto"/>
+          <w:sz w:val="28"/>
+          <w:szCs w:val="28"/>
+        </w:rPr>
+      </w:pPr>
+      <w:bookmarkStart w:id="13" w:name="_Toc232602898"/>
+      <w:r>
+        <w:rPr>
+          <w:rFonts w:ascii="Times New Roman" w:hAnsi="Times New Roman" w:cs="Times New Roman"/>
+          <w:color w:val="auto"/>
           <w:sz w:val="28"/>
           <w:szCs w:val="28"/>
         </w:rPr>
         <w:lastRenderedPageBreak/>
         <w:t>Графическое представление</w:t>
       </w:r>
+      <w:bookmarkEnd w:id="13"/>
     </w:p>
     <w:p>
       <w:pPr>
@@ -9007,6 +9948,46 @@
     </w:p>
     <w:p>
       <w:pPr>
+        <w:pStyle w:val="2"/>
+        <w:widowControl/>
+        <w:numPr>
+          <w:ilvl w:val="1"/>
+          <w:numId w:val="1"/>
+        </w:numPr>
+        <w:autoSpaceDE/>
+        <w:autoSpaceDN/>
+        <w:spacing w:before="40" w:line="360" w:lineRule="auto"/>
+        <w:jc w:val="both"/>
+        <w:rPr>
+          <w:rFonts w:ascii="Times New Roman" w:hAnsi="Times New Roman" w:cs="Times New Roman"/>
+          <w:color w:val="auto"/>
+          <w:sz w:val="28"/>
+          <w:szCs w:val="28"/>
+        </w:rPr>
+      </w:pPr>
+      <w:r>
+        <w:rPr>
+          <w:rFonts w:ascii="Times New Roman" w:hAnsi="Times New Roman" w:cs="Times New Roman"/>
+          <w:color w:val="auto"/>
+          <w:sz w:val="28"/>
+          <w:szCs w:val="28"/>
+        </w:rPr>
+        <w:t xml:space="preserve"> </w:t>
+      </w:r>
+      <w:bookmarkStart w:id="14" w:name="_Toc232602899"/>
+      <w:r>
+        <w:rPr>
+          <w:rFonts w:ascii="Times New Roman" w:hAnsi="Times New Roman" w:cs="Times New Roman"/>
+          <w:color w:val="auto"/>
+          <w:sz w:val="28"/>
+          <w:szCs w:val="28"/>
+        </w:rPr>
+        <w:t>Итоговый вывод</w:t>
+      </w:r>
+      <w:bookmarkEnd w:id="14"/>
+    </w:p>
+    <w:p>
+      <w:pPr>
         <w:pStyle w:val="a6"/>
         <w:spacing w:line="360" w:lineRule="auto"/>
         <w:ind w:left="0"/>
@@ -9017,54 +9998,10 @@
           <w:szCs w:val="28"/>
         </w:rPr>
       </w:pPr>
-    </w:p>
-    <w:p>
-      <w:pPr>
-        <w:pStyle w:val="a6"/>
-        <w:numPr>
-          <w:ilvl w:val="1"/>
-          <w:numId w:val="1"/>
-        </w:numPr>
-        <w:spacing w:line="360" w:lineRule="auto"/>
-        <w:jc w:val="both"/>
+      <w:r>
         <w:rPr>
           <w:b/>
-          <w:sz w:val="28"/>
-          <w:szCs w:val="28"/>
-        </w:rPr>
-      </w:pPr>
-      <w:r>
-        <w:rPr>
-          <w:b/>
-          <w:sz w:val="28"/>
-          <w:szCs w:val="28"/>
-        </w:rPr>
-        <w:t xml:space="preserve"> </w:t>
-      </w:r>
-      <w:r>
-        <w:rPr>
-          <w:b/>
-          <w:sz w:val="28"/>
-          <w:szCs w:val="28"/>
-        </w:rPr>
-        <w:t>Итоговый вывод</w:t>
-      </w:r>
-    </w:p>
-    <w:p>
-      <w:pPr>
-        <w:pStyle w:val="a6"/>
-        <w:spacing w:line="360" w:lineRule="auto"/>
-        <w:ind w:left="0"/>
-        <w:jc w:val="center"/>
-        <w:rPr>
-          <w:b/>
-          <w:sz w:val="28"/>
-          <w:szCs w:val="28"/>
-        </w:rPr>
-      </w:pPr>
-      <w:r>
-        <w:rPr>
-          <w:b/>
+          <w:noProof/>
           <w:sz w:val="28"/>
           <w:szCs w:val="28"/>
         </w:rPr>
@@ -9604,8 +10541,16 @@
           <w:sz w:val="28"/>
           <w:szCs w:val="28"/>
         </w:rPr>
+        <w:t xml:space="preserve">Записаны и решены необходимые условия первого порядка. Найдено 13 стационарных точек, из которых только 3 являются действительными и </w:t>
+      </w:r>
+      <w:r>
+        <w:rPr>
+          <w:bCs/>
+          <w:sz w:val="28"/>
+          <w:szCs w:val="28"/>
+        </w:rPr>
         <w:lastRenderedPageBreak/>
-        <w:t>Записаны и решены необходимые условия первого порядка. Найдено 13 стационарных точек, из которых только 3 являются действительными и удовлетворяют ограничениям.</w:t>
+        <w:t>удовлетворяют ограничениям.</w:t>
       </w:r>
     </w:p>
     <w:p>
@@ -10447,6 +11392,7 @@
           <w:szCs w:val="28"/>
         </w:rPr>
       </w:pPr>
+      <w:bookmarkStart w:id="15" w:name="_Toc232602900"/>
       <w:r>
         <w:rPr>
           <w:rFonts w:ascii="Times New Roman" w:hAnsi="Times New Roman" w:cs="Times New Roman"/>
@@ -10454,17 +11400,9 @@
           <w:sz w:val="28"/>
           <w:szCs w:val="28"/>
         </w:rPr>
-        <w:t xml:space="preserve">5. </w:t>
-      </w:r>
-      <w:r>
-        <w:rPr>
-          <w:rFonts w:ascii="Times New Roman" w:hAnsi="Times New Roman" w:cs="Times New Roman"/>
-          <w:color w:val="auto"/>
-          <w:sz w:val="28"/>
-          <w:szCs w:val="28"/>
-        </w:rPr>
         <w:t>Вывод</w:t>
       </w:r>
+      <w:bookmarkEnd w:id="15"/>
     </w:p>
     <w:p>
       <w:pPr>
@@ -12722,6 +13660,7 @@
   <w:style w:type="character" w:default="1" w:styleId="a0">
     <w:name w:val="Default Paragraph Font"/>
     <w:uiPriority w:val="1"/>
+    <w:semiHidden/>
     <w:unhideWhenUsed/>
   </w:style>
   <w:style w:type="table" w:default="1" w:styleId="a1">

</xml_diff>